<commit_message>
docs(features): video-confirm web dashboard search flow (#1 fixed feature)
§11.4.143 real-user-journey recording of the Боба web dashboard search,
driven through its OWN UI in a real browser (playwright over the macOS↔VM
tunnel) — NOT a deep-link/shortcut.

Journey: launch → type "debian" → submit → live results → completed.
On-screen verdict (Claude-vision, docs/qa/recordings-20260615/
boba-web-search-flow-verdict.md): dashboard loads (29 trackers, qBit
connected), live "Found 829 results..." with spinner (confirms BUG-2 live
grid on the real UI), completes at "829 results (288 merged)" / 1 Completed.
The operator's #1 complaint is verifiably resolved on the user-facing UI.

Artifacts (external per operator, /Volumes/T7/Downloads/Recordings/):
boba-web-search-flow.mp4 + 4 frames. Marked POST /api/v1/search row
VIDEO-CONFIRMED; HTML/PDF/DOCX exports regenerated.

Co-Authored-By: Claude Opus 4.8 <noreply@anthropic.com>
</commit_message>
<xml_diff>
--- a/docs/features/Status.docx
+++ b/docs/features/Status.docx
@@ -1170,18 +1170,58 @@
               <w:pStyle w:val="Compact"/>
             </w:pPr>
             <w:r>
-              <w:t xml:space="preserve">tested-green-in-suite</w:t>
-            </w:r>
-          </w:p>
-        </w:tc>
-        <w:tc>
-          <w:tcPr/>
-          <w:p>
-            <w:pPr>
-              <w:pStyle w:val="Compact"/>
-            </w:pPr>
-            <w:r>
-              <w:t xml:space="preserve">PENDING</w:t>
+              <w:t xml:space="preserve">tested-green-in-suite + LIVE</w:t>
+            </w:r>
+          </w:p>
+        </w:tc>
+        <w:tc>
+          <w:tcPr/>
+          <w:p>
+            <w:pPr>
+              <w:pStyle w:val="Compact"/>
+            </w:pPr>
+            <w:r>
+              <w:rPr>
+                <w:b/>
+                <w:bCs/>
+              </w:rPr>
+              <w:t xml:space="preserve">VIDEO-CONFIRMED 2026-06-16</w:t>
+            </w:r>
+            <w:r>
+              <w:t xml:space="preserve"> </w:t>
+            </w:r>
+            <w:r>
+              <w:t xml:space="preserve">— real web-UI journey (</w:t>
+            </w:r>
+            <w:r>
+              <w:rPr>
+                <w:rStyle w:val="VerbatimChar"/>
+              </w:rPr>
+              <w:t xml:space="preserve">debian</w:t>
+            </w:r>
+            <w:r>
+              <w:t xml:space="preserve">→829 found/288 merged),</w:t>
+            </w:r>
+            <w:r>
+              <w:t xml:space="preserve"> </w:t>
+            </w:r>
+            <w:r>
+              <w:rPr>
+                <w:rStyle w:val="VerbatimChar"/>
+              </w:rPr>
+              <w:t xml:space="preserve">boba-web-search-flow.mp4</w:t>
+            </w:r>
+            <w:r>
+              <w:t xml:space="preserve">; verdict</w:t>
+            </w:r>
+            <w:r>
+              <w:t xml:space="preserve"> </w:t>
+            </w:r>
+            <w:r>
+              <w:rPr>
+                <w:rStyle w:val="VerbatimChar"/>
+              </w:rPr>
+              <w:t xml:space="preserve">docs/qa/recordings-20260615/boba-web-search-flow-verdict.md</w:t>
             </w:r>
           </w:p>
         </w:tc>

</xml_diff>

<commit_message>
docs(features): Status ledger Rev 7 — proven search/auth/healthz fixes (§11.4.153)
Updated the feature ledger to reflect this session's nezha-proven state, evidence-
cited (no this-session-unsupported claims, §11.4.6):
- limetorrents + multi-word URL-encoding fix → PASS-LIVE (da7d709 + §11.4.85 stress/chaos)
- rutracker/nnmclub/kinozal/iptorrents auth → PASS-LIVE 50/50/50/49 (cookie injection 2fc29fc)
- kickass → Won't-fix structurally-impossible §11.4.112 (docs/research/kickass_403_20260616/)
- /auth/status cookie reflection → PASS-LIVE (9c2f8dc)
- NEW GET /api/v1/healthz JSON endpoint (137d7ff)
Evidence: docs/qa/search-fix-verify-20260616/ (2600 results/23 trackers/0 encoding
crashes). All 6 exports (HTML+PDF+DOCX × Status + Status_Summary) regenerated.

Co-Authored-By: Claude Opus 4.8 <noreply@anthropic.com>
</commit_message>
<xml_diff>
--- a/docs/features/Status.docx
+++ b/docs/features/Status.docx
@@ -2,14 +2,6 @@
 <file path=word/document.xml><?xml version="1.0" encoding="utf-8"?>
 <w:document xmlns:w="http://schemas.openxmlformats.org/wordprocessingml/2006/main" xmlns:m="http://schemas.openxmlformats.org/officeDocument/2006/math" xmlns:r="http://schemas.openxmlformats.org/officeDocument/2006/relationships" xmlns:o="urn:schemas-microsoft-com:office:office" xmlns:v="urn:schemas-microsoft-com:vml" xmlns:w10="urn:schemas-microsoft-com:office:word" xmlns:a="http://schemas.openxmlformats.org/drawingml/2006/main" xmlns:pic="http://schemas.openxmlformats.org/drawingml/2006/picture" xmlns:wp="http://schemas.openxmlformats.org/drawingml/2006/wordprocessingDrawing">
   <w:body>
-    <w:p>
-      <w:pPr>
-        <w:pStyle w:val="Title"/>
-      </w:pPr>
-      <w:r>
-        <w:t xml:space="preserve">Status</w:t>
-      </w:r>
-    </w:p>
     <w:bookmarkStart w:id="57" w:name="boba-feature-status-all-components"/>
     <w:p>
       <w:pPr>
@@ -34,7 +26,7 @@
         <w:t xml:space="preserve"> </w:t>
       </w:r>
       <w:r>
-        <w:t xml:space="preserve">6</w:t>
+        <w:t xml:space="preserve">7</w:t>
       </w:r>
       <w:r>
         <w:t xml:space="preserve"> </w:t>
@@ -50,7 +42,7 @@
         <w:t xml:space="preserve"> </w:t>
       </w:r>
       <w:r>
-        <w:t xml:space="preserve">2026-06-16T18:30:00Z</w:t>
+        <w:t xml:space="preserve">2026-06-16T23:30:00Z</w:t>
       </w:r>
       <w:r>
         <w:t xml:space="preserve"> </w:t>
@@ -119,6 +111,264 @@
       </w:r>
       <w:r>
         <w:t xml:space="preserve">.</w:t>
+      </w:r>
+    </w:p>
+    <w:p>
+      <w:pPr>
+        <w:pStyle w:val="BlockText"/>
+      </w:pPr>
+      <w:r>
+        <w:rPr>
+          <w:b/>
+          <w:bCs/>
+        </w:rPr>
+        <w:t xml:space="preserve">Rev 7 (2026-06-16) — live-PASS update for the search/auth fix batch (HEAD</w:t>
+      </w:r>
+      <w:r>
+        <w:rPr>
+          <w:b/>
+          <w:bCs/>
+        </w:rPr>
+        <w:t xml:space="preserve"> </w:t>
+      </w:r>
+      <w:r>
+        <w:rPr>
+          <w:rStyle w:val="VerbatimChar"/>
+          <w:b/>
+          <w:bCs/>
+        </w:rPr>
+        <w:t xml:space="preserve">7e9cab5</w:t>
+      </w:r>
+      <w:r>
+        <w:rPr>
+          <w:b/>
+          <w:bCs/>
+        </w:rPr>
+        <w:t xml:space="preserve">):</w:t>
+      </w:r>
+      <w:r>
+        <w:t xml:space="preserve"> </w:t>
+      </w:r>
+      <w:r>
+        <w:t xml:space="preserve">the multi-word URL-encoding fix (</w:t>
+      </w:r>
+      <w:r>
+        <w:rPr>
+          <w:rStyle w:val="VerbatimChar"/>
+        </w:rPr>
+        <w:t xml:space="preserve">da7d709</w:t>
+      </w:r>
+      <w:r>
+        <w:t xml:space="preserve">, ~17 nova3 plugins), the new</w:t>
+      </w:r>
+      <w:r>
+        <w:t xml:space="preserve"> </w:t>
+      </w:r>
+      <w:r>
+        <w:rPr>
+          <w:rStyle w:val="VerbatimChar"/>
+        </w:rPr>
+        <w:t xml:space="preserve">RUTRACKER_COOKIES</w:t>
+      </w:r>
+      <w:r>
+        <w:t xml:space="preserve"> </w:t>
+      </w:r>
+      <w:r>
+        <w:t xml:space="preserve">injection (</w:t>
+      </w:r>
+      <w:r>
+        <w:rPr>
+          <w:rStyle w:val="VerbatimChar"/>
+        </w:rPr>
+        <w:t xml:space="preserve">2fc29fc</w:t>
+      </w:r>
+      <w:r>
+        <w:t xml:space="preserve">),</w:t>
+      </w:r>
+      <w:r>
+        <w:t xml:space="preserve"> </w:t>
+      </w:r>
+      <w:r>
+        <w:rPr>
+          <w:rStyle w:val="VerbatimChar"/>
+        </w:rPr>
+        <w:t xml:space="preserve">NNMCLUB_COOKIES</w:t>
+      </w:r>
+      <w:r>
+        <w:t xml:space="preserve"> </w:t>
+      </w:r>
+      <w:r>
+        <w:t xml:space="preserve">auth,</w:t>
+      </w:r>
+      <w:r>
+        <w:t xml:space="preserve"> </w:t>
+      </w:r>
+      <w:r>
+        <w:rPr>
+          <w:rStyle w:val="VerbatimChar"/>
+        </w:rPr>
+        <w:t xml:space="preserve">/auth/status</w:t>
+      </w:r>
+      <w:r>
+        <w:t xml:space="preserve"> </w:t>
+      </w:r>
+      <w:r>
+        <w:t xml:space="preserve">cookie reflection (</w:t>
+      </w:r>
+      <w:r>
+        <w:rPr>
+          <w:rStyle w:val="VerbatimChar"/>
+        </w:rPr>
+        <w:t xml:space="preserve">9c2f8dc</w:t>
+      </w:r>
+      <w:r>
+        <w:t xml:space="preserve">), the new</w:t>
+      </w:r>
+      <w:r>
+        <w:t xml:space="preserve"> </w:t>
+      </w:r>
+      <w:r>
+        <w:rPr>
+          <w:rStyle w:val="VerbatimChar"/>
+        </w:rPr>
+        <w:t xml:space="preserve">GET /api/v1/healthz</w:t>
+      </w:r>
+      <w:r>
+        <w:t xml:space="preserve"> </w:t>
+      </w:r>
+      <w:r>
+        <w:t xml:space="preserve">JSON endpoint (</w:t>
+      </w:r>
+      <w:r>
+        <w:rPr>
+          <w:rStyle w:val="VerbatimChar"/>
+        </w:rPr>
+        <w:t xml:space="preserve">137d7ff</w:t>
+      </w:r>
+      <w:r>
+        <w:t xml:space="preserve">), and §11.4.85 stress+chaos coverage for the multi-word fix (</w:t>
+      </w:r>
+      <w:r>
+        <w:rPr>
+          <w:rStyle w:val="VerbatimChar"/>
+        </w:rPr>
+        <w:t xml:space="preserve">7e9cab5</w:t>
+      </w:r>
+      <w:r>
+        <w:t xml:space="preserve">) were all PROVEN end-to-end on the live nezha stack — full-fleet</w:t>
+      </w:r>
+      <w:r>
+        <w:t xml:space="preserve"> </w:t>
+      </w:r>
+      <w:r>
+        <w:rPr>
+          <w:rStyle w:val="VerbatimChar"/>
+        </w:rPr>
+        <w:t xml:space="preserve">the matrix</w:t>
+      </w:r>
+      <w:r>
+        <w:t xml:space="preserve"> </w:t>
+      </w:r>
+      <w:r>
+        <w:t xml:space="preserve">=</w:t>
+      </w:r>
+      <w:r>
+        <w:t xml:space="preserve"> </w:t>
+      </w:r>
+      <w:r>
+        <w:rPr>
+          <w:b/>
+          <w:bCs/>
+        </w:rPr>
+        <w:t xml:space="preserve">2600 results / 23 contributing trackers / zero</w:t>
+      </w:r>
+      <w:r>
+        <w:rPr>
+          <w:b/>
+          <w:bCs/>
+        </w:rPr>
+        <w:t xml:space="preserve"> </w:t>
+      </w:r>
+      <w:r>
+        <w:rPr>
+          <w:rStyle w:val="VerbatimChar"/>
+          <w:b/>
+          <w:bCs/>
+        </w:rPr>
+        <w:t xml:space="preserve">plugin_bad_query_encoding</w:t>
+      </w:r>
+      <w:r>
+        <w:t xml:space="preserve">, all four private trackers authenticate (rutracker 50, nnmclub 50, kinozal 50, iptorrents 49). Evidence:</w:t>
+      </w:r>
+      <w:r>
+        <w:t xml:space="preserve"> </w:t>
+      </w:r>
+      <w:r>
+        <w:rPr>
+          <w:rStyle w:val="VerbatimChar"/>
+        </w:rPr>
+        <w:t xml:space="preserve">docs/qa/search-fix-verify-20260616/</w:t>
+      </w:r>
+      <w:r>
+        <w:t xml:space="preserve">.</w:t>
+      </w:r>
+      <w:r>
+        <w:t xml:space="preserve"> </w:t>
+      </w:r>
+      <w:r>
+        <w:rPr>
+          <w:rStyle w:val="VerbatimChar"/>
+        </w:rPr>
+        <w:t xml:space="preserve">kickass.py</w:t>
+      </w:r>
+      <w:r>
+        <w:t xml:space="preserve"> </w:t>
+      </w:r>
+      <w:r>
+        <w:t xml:space="preserve">reclassified</w:t>
+      </w:r>
+      <w:r>
+        <w:t xml:space="preserve"> </w:t>
+      </w:r>
+      <w:r>
+        <w:rPr>
+          <w:b/>
+          <w:bCs/>
+        </w:rPr>
+        <w:t xml:space="preserve">Won’t-fix structurally-impossible (§11.4.112)</w:t>
+      </w:r>
+      <w:r>
+        <w:t xml:space="preserve"> </w:t>
+      </w:r>
+      <w:r>
+        <w:t xml:space="preserve">per</w:t>
+      </w:r>
+      <w:r>
+        <w:t xml:space="preserve"> </w:t>
+      </w:r>
+      <w:r>
+        <w:rPr>
+          <w:rStyle w:val="VerbatimChar"/>
+        </w:rPr>
+        <w:t xml:space="preserve">docs/research/kickass_403_20260616/</w:t>
+      </w:r>
+      <w:r>
+        <w:t xml:space="preserve">. NOTE (§11.4.6): no Go files were touched this session — the Go rows are unchanged (the pre-existing</w:t>
+      </w:r>
+      <w:r>
+        <w:t xml:space="preserve"> </w:t>
+      </w:r>
+      <w:r>
+        <w:rPr>
+          <w:rStyle w:val="VerbatimChar"/>
+        </w:rPr>
+        <w:t xml:space="preserve">magnet_stress_chaos_test.go</w:t>
+      </w:r>
+      <w:r>
+        <w:t xml:space="preserve"> </w:t>
+      </w:r>
+      <w:r>
+        <w:t xml:space="preserve">guard stands; no NEW Go query-encoding guard was added this session, so none is claimed here).</w:t>
       </w:r>
     </w:p>
     <w:p>
@@ -1480,7 +1730,7 @@
               <w:pStyle w:val="Compact"/>
             </w:pPr>
             <w:r>
-              <w:t xml:space="preserve">68</w:t>
+              <w:t xml:space="preserve">69</w:t>
             </w:r>
           </w:p>
         </w:tc>
@@ -1892,7 +2142,28 @@
           <w:b/>
           <w:bCs/>
         </w:rPr>
-        <w:t xml:space="preserve">Total features cataloged: 288</w:t>
+        <w:t xml:space="preserve">Total features cataloged: 289</w:t>
+      </w:r>
+      <w:r>
+        <w:t xml:space="preserve"> </w:t>
+      </w:r>
+      <w:r>
+        <w:t xml:space="preserve">(Rev 7: +1 — new</w:t>
+      </w:r>
+      <w:r>
+        <w:t xml:space="preserve"> </w:t>
+      </w:r>
+      <w:r>
+        <w:rPr>
+          <w:rStyle w:val="VerbatimChar"/>
+        </w:rPr>
+        <w:t xml:space="preserve">GET /api/v1/healthz</w:t>
+      </w:r>
+      <w:r>
+        <w:t xml:space="preserve"> </w:t>
+      </w:r>
+      <w:r>
+        <w:t xml:space="preserve">endpoint)</w:t>
       </w:r>
     </w:p>
     <w:p>
@@ -4048,7 +4319,68 @@
               <w:pStyle w:val="Compact"/>
             </w:pPr>
             <w:r>
-              <w:t xml:space="preserve">partial — live-gated</w:t>
+              <w:rPr>
+                <w:b/>
+                <w:bCs/>
+              </w:rPr>
+              <w:t xml:space="preserve">PASS — LIVE 2026-06-16</w:t>
+            </w:r>
+            <w:r>
+              <w:t xml:space="preserve"> </w:t>
+            </w:r>
+            <w:r>
+              <w:t xml:space="preserve">—</w:t>
+            </w:r>
+            <w:r>
+              <w:t xml:space="preserve"> </w:t>
+            </w:r>
+            <w:r>
+              <w:rPr>
+                <w:rStyle w:val="VerbatimChar"/>
+              </w:rPr>
+              <w:t xml:space="preserve">RUTRACKER_COOKIES</w:t>
+            </w:r>
+            <w:r>
+              <w:t xml:space="preserve"> </w:t>
+            </w:r>
+            <w:r>
+              <w:t xml:space="preserve">cookie path authenticates (</w:t>
+            </w:r>
+            <w:r>
+              <w:rPr>
+                <w:rStyle w:val="VerbatimChar"/>
+              </w:rPr>
+              <w:t xml:space="preserve">2fc29fc</w:t>
+            </w:r>
+            <w:r>
+              <w:t xml:space="preserve">); rutracker</w:t>
+            </w:r>
+            <w:r>
+              <w:t xml:space="preserve"> </w:t>
+            </w:r>
+            <w:r>
+              <w:rPr>
+                <w:rStyle w:val="VerbatimChar"/>
+              </w:rPr>
+              <w:t xml:space="preserve">the matrix</w:t>
+            </w:r>
+            <w:r>
+              <w:t xml:space="preserve"> </w:t>
+            </w:r>
+            <w:r>
+              <w:t xml:space="preserve">= 50 real results on nezha (</w:t>
+            </w:r>
+            <w:r>
+              <w:rPr>
+                <w:rStyle w:val="VerbatimChar"/>
+              </w:rPr>
+              <w:t xml:space="preserve">docs/qa/search-fix-verify-20260616/</w:t>
+            </w:r>
+            <w:r>
+              <w:t xml:space="preserve"> </w:t>
+            </w:r>
+            <w:r>
+              <w:t xml:space="preserve">§1)</w:t>
             </w:r>
           </w:p>
         </w:tc>
@@ -4330,16 +4662,74 @@
               </w:rPr>
               <w:t xml:space="preserve">test_auth_state_ui.py</w:t>
             </w:r>
-          </w:p>
-        </w:tc>
-        <w:tc>
-          <w:tcPr/>
-          <w:p>
-            <w:pPr>
-              <w:pStyle w:val="Compact"/>
-            </w:pPr>
-            <w:r>
-              <w:t xml:space="preserve">tested-green-in-suite</w:t>
+            <w:r>
+              <w:t xml:space="preserve">; auth-status cookie-reflection test (§1.1)</w:t>
+            </w:r>
+          </w:p>
+        </w:tc>
+        <w:tc>
+          <w:tcPr/>
+          <w:p>
+            <w:pPr>
+              <w:pStyle w:val="Compact"/>
+            </w:pPr>
+            <w:r>
+              <w:rPr>
+                <w:b/>
+                <w:bCs/>
+              </w:rPr>
+              <w:t xml:space="preserve">PASS — LIVE 2026-06-16</w:t>
+            </w:r>
+            <w:r>
+              <w:t xml:space="preserve"> </w:t>
+            </w:r>
+            <w:r>
+              <w:t xml:space="preserve">— now reflects</w:t>
+            </w:r>
+            <w:r>
+              <w:t xml:space="preserve"> </w:t>
+            </w:r>
+            <w:r>
+              <w:rPr>
+                <w:rStyle w:val="VerbatimChar"/>
+              </w:rPr>
+              <w:t xml:space="preserve">RUTRACKER_COOKIES</w:t>
+            </w:r>
+            <w:r>
+              <w:t xml:space="preserve">/</w:t>
+            </w:r>
+            <w:r>
+              <w:rPr>
+                <w:rStyle w:val="VerbatimChar"/>
+              </w:rPr>
+              <w:t xml:space="preserve">NNMCLUB_COOKIES</w:t>
+            </w:r>
+            <w:r>
+              <w:t xml:space="preserve"> </w:t>
+            </w:r>
+            <w:r>
+              <w:t xml:space="preserve">env before first search (</w:t>
+            </w:r>
+            <w:r>
+              <w:rPr>
+                <w:rStyle w:val="VerbatimChar"/>
+              </w:rPr>
+              <w:t xml:space="preserve">9c2f8dc</w:t>
+            </w:r>
+            <w:r>
+              <w:t xml:space="preserve">), so dashboard chips show rutracker/nnmclub green (</w:t>
+            </w:r>
+            <w:r>
+              <w:rPr>
+                <w:rStyle w:val="VerbatimChar"/>
+              </w:rPr>
+              <w:t xml:space="preserve">docs/qa/search-fix-verify-20260616/</w:t>
+            </w:r>
+            <w:r>
+              <w:t xml:space="preserve"> </w:t>
+            </w:r>
+            <w:r>
+              <w:t xml:space="preserve">§3)</w:t>
             </w:r>
           </w:p>
         </w:tc>
@@ -8285,6 +8675,150 @@
             </w:pPr>
             <w:r>
               <w:t xml:space="preserve">Video</w:t>
+            </w:r>
+          </w:p>
+        </w:tc>
+      </w:tr>
+      <w:tr>
+        <w:tc>
+          <w:tcPr/>
+          <w:p>
+            <w:pPr>
+              <w:pStyle w:val="Compact"/>
+            </w:pPr>
+            <w:r>
+              <w:rPr>
+                <w:rStyle w:val="VerbatimChar"/>
+              </w:rPr>
+              <w:t xml:space="preserve">GET /api/v1/healthz</w:t>
+            </w:r>
+            <w:r>
+              <w:t xml:space="preserve"> </w:t>
+            </w:r>
+            <w:r>
+              <w:t xml:space="preserve">— machine-parsable JSON health probe (</w:t>
+            </w:r>
+            <w:r>
+              <w:rPr>
+                <w:rStyle w:val="VerbatimChar"/>
+              </w:rPr>
+              <w:t xml:space="preserve">routes.py:37</w:t>
+            </w:r>
+            <w:r>
+              <w:t xml:space="preserve">)</w:t>
+            </w:r>
+          </w:p>
+        </w:tc>
+        <w:tc>
+          <w:tcPr/>
+          <w:p>
+            <w:pPr>
+              <w:pStyle w:val="Compact"/>
+            </w:pPr>
+            <w:r>
+              <w:t xml:space="preserve">implemented</w:t>
+            </w:r>
+          </w:p>
+        </w:tc>
+        <w:tc>
+          <w:tcPr/>
+          <w:p>
+            <w:pPr>
+              <w:pStyle w:val="Compact"/>
+            </w:pPr>
+            <w:r>
+              <w:t xml:space="preserve">yes</w:t>
+            </w:r>
+          </w:p>
+        </w:tc>
+        <w:tc>
+          <w:tcPr/>
+          <w:p>
+            <w:pPr>
+              <w:pStyle w:val="Compact"/>
+            </w:pPr>
+            <w:r>
+              <w:t xml:space="preserve">integration</w:t>
+            </w:r>
+            <w:r>
+              <w:t xml:space="preserve"> </w:t>
+            </w:r>
+            <w:r>
+              <w:rPr>
+                <w:rStyle w:val="VerbatimChar"/>
+              </w:rPr>
+              <w:t xml:space="preserve">test_merge_api.py</w:t>
+            </w:r>
+          </w:p>
+        </w:tc>
+        <w:tc>
+          <w:tcPr/>
+          <w:p>
+            <w:pPr>
+              <w:pStyle w:val="Compact"/>
+            </w:pPr>
+            <w:r>
+              <w:rPr>
+                <w:b/>
+                <w:bCs/>
+              </w:rPr>
+              <w:t xml:space="preserve">PASS — LIVE 2026-06-16</w:t>
+            </w:r>
+            <w:r>
+              <w:t xml:space="preserve"> </w:t>
+            </w:r>
+            <w:r>
+              <w:t xml:space="preserve">— NEW endpoint (</w:t>
+            </w:r>
+            <w:r>
+              <w:rPr>
+                <w:rStyle w:val="VerbatimChar"/>
+              </w:rPr>
+              <w:t xml:space="preserve">137d7ff</w:t>
+            </w:r>
+            <w:r>
+              <w:t xml:space="preserve">): a bare</w:t>
+            </w:r>
+            <w:r>
+              <w:t xml:space="preserve"> </w:t>
+            </w:r>
+            <w:r>
+              <w:rPr>
+                <w:rStyle w:val="VerbatimChar"/>
+              </w:rPr>
+              <w:t xml:space="preserve">/healthz</w:t>
+            </w:r>
+            <w:r>
+              <w:t xml:space="preserve"> </w:t>
+            </w:r>
+            <w:r>
+              <w:t xml:space="preserve">was swallowed by the SPA catch-all; now mounted under</w:t>
+            </w:r>
+            <w:r>
+              <w:t xml:space="preserve"> </w:t>
+            </w:r>
+            <w:r>
+              <w:rPr>
+                <w:rStyle w:val="VerbatimChar"/>
+              </w:rPr>
+              <w:t xml:space="preserve">/api/v1</w:t>
+            </w:r>
+            <w:r>
+              <w:t xml:space="preserve"> </w:t>
+            </w:r>
+            <w:r>
+              <w:t xml:space="preserve">returning JSON (§11.4.43)</w:t>
+            </w:r>
+          </w:p>
+        </w:tc>
+        <w:tc>
+          <w:tcPr/>
+          <w:p>
+            <w:pPr>
+              <w:pStyle w:val="Compact"/>
+            </w:pPr>
+            <w:r>
+              <w:t xml:space="preserve">N/A (no UI — JSON health probe; test-covered)</w:t>
             </w:r>
           </w:p>
         </w:tc>
@@ -18640,16 +19174,107 @@
               </w:rPr>
               <w:t xml:space="preserve">test_plugin_parsers_stress_chaos.py</w:t>
             </w:r>
-          </w:p>
-        </w:tc>
-        <w:tc>
-          <w:tcPr/>
-          <w:p>
-            <w:pPr>
-              <w:pStyle w:val="Compact"/>
-            </w:pPr>
-            <w:r>
-              <w:t xml:space="preserve">tested-green-in-suite</w:t>
+            <w:r>
+              <w:t xml:space="preserve">; multi-word</w:t>
+            </w:r>
+            <w:r>
+              <w:t xml:space="preserve"> </w:t>
+            </w:r>
+            <w:r>
+              <w:rPr>
+                <w:rStyle w:val="VerbatimChar"/>
+              </w:rPr>
+              <w:t xml:space="preserve">tests/unit/test_plugin_multiword_query_encoding.py</w:t>
+            </w:r>
+            <w:r>
+              <w:t xml:space="preserve"> </w:t>
+            </w:r>
+            <w:r>
+              <w:t xml:space="preserve">+ stress/chaos</w:t>
+            </w:r>
+            <w:r>
+              <w:t xml:space="preserve"> </w:t>
+            </w:r>
+            <w:r>
+              <w:rPr>
+                <w:rStyle w:val="VerbatimChar"/>
+              </w:rPr>
+              <w:t xml:space="preserve">tests/stress_chaos/test_multiword_query_encoding_{stress,chaos}.py</w:t>
+            </w:r>
+            <w:r>
+              <w:t xml:space="preserve"> </w:t>
+            </w:r>
+            <w:r>
+              <w:t xml:space="preserve">(§11.4.85)</w:t>
+            </w:r>
+          </w:p>
+        </w:tc>
+        <w:tc>
+          <w:tcPr/>
+          <w:p>
+            <w:pPr>
+              <w:pStyle w:val="Compact"/>
+            </w:pPr>
+            <w:r>
+              <w:rPr>
+                <w:b/>
+                <w:bCs/>
+              </w:rPr>
+              <w:t xml:space="preserve">PASS — LIVE 2026-06-16</w:t>
+            </w:r>
+            <w:r>
+              <w:t xml:space="preserve"> </w:t>
+            </w:r>
+            <w:r>
+              <w:t xml:space="preserve">— multi-word URL-encoding fix (</w:t>
+            </w:r>
+            <w:r>
+              <w:rPr>
+                <w:rStyle w:val="VerbatimChar"/>
+              </w:rPr>
+              <w:t xml:space="preserve">da7d709</w:t>
+            </w:r>
+            <w:r>
+              <w:t xml:space="preserve">) verified on nezha:</w:t>
+            </w:r>
+            <w:r>
+              <w:t xml:space="preserve"> </w:t>
+            </w:r>
+            <w:r>
+              <w:rPr>
+                <w:rStyle w:val="VerbatimChar"/>
+              </w:rPr>
+              <w:t xml:space="preserve">the matrix</w:t>
+            </w:r>
+            <w:r>
+              <w:t xml:space="preserve"> </w:t>
+            </w:r>
+            <w:r>
+              <w:t xml:space="preserve">returns results, zero</w:t>
+            </w:r>
+            <w:r>
+              <w:t xml:space="preserve"> </w:t>
+            </w:r>
+            <w:r>
+              <w:rPr>
+                <w:rStyle w:val="VerbatimChar"/>
+              </w:rPr>
+              <w:t xml:space="preserve">plugin_bad_query_encoding</w:t>
+            </w:r>
+            <w:r>
+              <w:t xml:space="preserve"> </w:t>
+            </w:r>
+            <w:r>
+              <w:t xml:space="preserve">(</w:t>
+            </w:r>
+            <w:r>
+              <w:rPr>
+                <w:rStyle w:val="VerbatimChar"/>
+              </w:rPr>
+              <w:t xml:space="preserve">docs/qa/search-fix-verify-20260616/</w:t>
+            </w:r>
+            <w:r>
+              <w:t xml:space="preserve">)</w:t>
             </w:r>
           </w:p>
         </w:tc>
@@ -19426,7 +20051,7 @@
               <w:pStyle w:val="Compact"/>
             </w:pPr>
             <w:r>
-              <w:t xml:space="preserve">implemented</w:t>
+              <w:t xml:space="preserve">implemented (degrades to honest empty)</w:t>
             </w:r>
           </w:p>
         </w:tc>
@@ -19468,18 +20093,55 @@
               <w:pStyle w:val="Compact"/>
             </w:pPr>
             <w:r>
-              <w:t xml:space="preserve">tested-green-in-suite</w:t>
-            </w:r>
-          </w:p>
-        </w:tc>
-        <w:tc>
-          <w:tcPr/>
-          <w:p>
-            <w:pPr>
-              <w:pStyle w:val="Compact"/>
-            </w:pPr>
-            <w:r>
-              <w:t xml:space="preserve">N/A (no UI — test-covered + exercised by web search flow) (tracker backend)</w:t>
+              <w:rPr>
+                <w:b/>
+                <w:bCs/>
+              </w:rPr>
+              <w:t xml:space="preserve">Won’t-fix — structurally-impossible (§11.4.112)</w:t>
+            </w:r>
+            <w:r>
+              <w:t xml:space="preserve"> </w:t>
+            </w:r>
+            <w:r>
+              <w:t xml:space="preserve">— every live KAT mirror is Cloudflare-403 or a JS bot-challenge a non-JS</w:t>
+            </w:r>
+            <w:r>
+              <w:t xml:space="preserve"> </w:t>
+            </w:r>
+            <w:r>
+              <w:rPr>
+                <w:rStyle w:val="VerbatimChar"/>
+              </w:rPr>
+              <w:t xml:space="preserve">urllib</w:t>
+            </w:r>
+            <w:r>
+              <w:t xml:space="preserve"> </w:t>
+            </w:r>
+            <w:r>
+              <w:t xml:space="preserve">client cannot clear; deep multi-angle research (§11.4.150) + live probes 2026-06-16 in</w:t>
+            </w:r>
+            <w:r>
+              <w:t xml:space="preserve"> </w:t>
+            </w:r>
+            <w:r>
+              <w:rPr>
+                <w:rStyle w:val="VerbatimChar"/>
+              </w:rPr>
+              <w:t xml:space="preserve">docs/research/kickass_403_20260616/</w:t>
+            </w:r>
+            <w:r>
+              <w:t xml:space="preserve">; upstream maintainer confirms. Reopen only on NEW evidence a mirror serves listing HTML to a non-JS client (§11.4.34/§11.4.7)</w:t>
+            </w:r>
+          </w:p>
+        </w:tc>
+        <w:tc>
+          <w:tcPr/>
+          <w:p>
+            <w:pPr>
+              <w:pStyle w:val="Compact"/>
+            </w:pPr>
+            <w:r>
+              <w:t xml:space="preserve">N/A (no UI — test-covered; structurally blocked upstream) (tracker backend)</w:t>
             </w:r>
           </w:p>
         </w:tc>
@@ -20096,7 +20758,75 @@
               <w:pStyle w:val="Compact"/>
             </w:pPr>
             <w:r>
-              <w:t xml:space="preserve">partial — freeleech-only policy</w:t>
+              <w:rPr>
+                <w:b/>
+                <w:bCs/>
+              </w:rPr>
+              <w:t xml:space="preserve">PASS — LIVE 2026-06-16</w:t>
+            </w:r>
+            <w:r>
+              <w:t xml:space="preserve"> </w:t>
+            </w:r>
+            <w:r>
+              <w:t xml:space="preserve">— full-fleet</w:t>
+            </w:r>
+            <w:r>
+              <w:t xml:space="preserve"> </w:t>
+            </w:r>
+            <w:r>
+              <w:rPr>
+                <w:rStyle w:val="VerbatimChar"/>
+              </w:rPr>
+              <w:t xml:space="preserve">the matrix</w:t>
+            </w:r>
+            <w:r>
+              <w:t xml:space="preserve"> </w:t>
+            </w:r>
+            <w:r>
+              <w:t xml:space="preserve">on nezha:</w:t>
+            </w:r>
+            <w:r>
+              <w:t xml:space="preserve"> </w:t>
+            </w:r>
+            <w:r>
+              <w:rPr>
+                <w:b/>
+                <w:bCs/>
+              </w:rPr>
+              <w:t xml:space="preserve">49</w:t>
+            </w:r>
+            <w:r>
+              <w:t xml:space="preserve"> </w:t>
+            </w:r>
+            <w:r>
+              <w:t xml:space="preserve">results,</w:t>
+            </w:r>
+            <w:r>
+              <w:t xml:space="preserve"> </w:t>
+            </w:r>
+            <w:r>
+              <w:rPr>
+                <w:rStyle w:val="VerbatimChar"/>
+              </w:rPr>
+              <w:t xml:space="preserve">success</w:t>
+            </w:r>
+            <w:r>
+              <w:t xml:space="preserve"> </w:t>
+            </w:r>
+            <w:r>
+              <w:t xml:space="preserve">(</w:t>
+            </w:r>
+            <w:r>
+              <w:rPr>
+                <w:rStyle w:val="VerbatimChar"/>
+              </w:rPr>
+              <w:t xml:space="preserve">docs/qa/search-fix-verify-20260616/</w:t>
+            </w:r>
+            <w:r>
+              <w:t xml:space="preserve"> </w:t>
+            </w:r>
+            <w:r>
+              <w:t xml:space="preserve">§6); freeleech-only policy enforced</w:t>
             </w:r>
           </w:p>
         </w:tc>
@@ -20134,7 +20864,7 @@
               <w:pStyle w:val="Compact"/>
             </w:pPr>
             <w:r>
-              <w:t xml:space="preserve">private (CAPTCHA)</w:t>
+              <w:t xml:space="preserve">private (cookies / CAPTCHA)</w:t>
             </w:r>
           </w:p>
         </w:tc>
@@ -20179,7 +20909,22 @@
               <w:t xml:space="preserve">test_tracker_auth_live.py</w:t>
             </w:r>
             <w:r>
-              <w:t xml:space="preserve">; stress</w:t>
+              <w:t xml:space="preserve">; cookie-injection</w:t>
+            </w:r>
+            <w:r>
+              <w:t xml:space="preserve"> </w:t>
+            </w:r>
+            <w:r>
+              <w:rPr>
+                <w:rStyle w:val="VerbatimChar"/>
+              </w:rPr>
+              <w:t xml:space="preserve">tests/unit/</w:t>
+            </w:r>
+            <w:r>
+              <w:t xml:space="preserve"> </w:t>
+            </w:r>
+            <w:r>
+              <w:t xml:space="preserve">rutracker-cookie test (§1.1); stress</w:t>
             </w:r>
             <w:r>
               <w:t xml:space="preserve"> </w:t>
@@ -20205,7 +20950,93 @@
               <w:pStyle w:val="Compact"/>
             </w:pPr>
             <w:r>
-              <w:t xml:space="preserve">partial — ReDoS fix in source, not yet deployed to container (RW-06); login operator-blocked BOB-008</w:t>
+              <w:rPr>
+                <w:b/>
+                <w:bCs/>
+              </w:rPr>
+              <w:t xml:space="preserve">PASS — LIVE 2026-06-16</w:t>
+            </w:r>
+            <w:r>
+              <w:t xml:space="preserve"> </w:t>
+            </w:r>
+            <w:r>
+              <w:t xml:space="preserve">— new</w:t>
+            </w:r>
+            <w:r>
+              <w:t xml:space="preserve"> </w:t>
+            </w:r>
+            <w:r>
+              <w:rPr>
+                <w:rStyle w:val="VerbatimChar"/>
+              </w:rPr>
+              <w:t xml:space="preserve">RUTRACKER_COOKIES</w:t>
+            </w:r>
+            <w:r>
+              <w:t xml:space="preserve"> </w:t>
+            </w:r>
+            <w:r>
+              <w:t xml:space="preserve">injection (</w:t>
+            </w:r>
+            <w:r>
+              <w:rPr>
+                <w:rStyle w:val="VerbatimChar"/>
+              </w:rPr>
+              <w:t xml:space="preserve">2fc29fc</w:t>
+            </w:r>
+            <w:r>
+              <w:t xml:space="preserve">) bypasses the CAPTCHA-walled login;</w:t>
+            </w:r>
+            <w:r>
+              <w:t xml:space="preserve"> </w:t>
+            </w:r>
+            <w:r>
+              <w:rPr>
+                <w:rStyle w:val="VerbatimChar"/>
+              </w:rPr>
+              <w:t xml:space="preserve">the matrix</w:t>
+            </w:r>
+            <w:r>
+              <w:t xml:space="preserve"> </w:t>
+            </w:r>
+            <w:r>
+              <w:t xml:space="preserve">returns</w:t>
+            </w:r>
+            <w:r>
+              <w:t xml:space="preserve"> </w:t>
+            </w:r>
+            <w:r>
+              <w:rPr>
+                <w:b/>
+                <w:bCs/>
+              </w:rPr>
+              <w:t xml:space="preserve">50</w:t>
+            </w:r>
+            <w:r>
+              <w:t xml:space="preserve"> </w:t>
+            </w:r>
+            <w:r>
+              <w:t xml:space="preserve">results incl. </w:t>
+            </w:r>
+            <w:r>
+              <w:t xml:space="preserve">“Матрица / The Matrix”</w:t>
+            </w:r>
+            <w:r>
+              <w:t xml:space="preserve"> </w:t>
+            </w:r>
+            <w:r>
+              <w:t xml:space="preserve">(</w:t>
+            </w:r>
+            <w:r>
+              <w:rPr>
+                <w:rStyle w:val="VerbatimChar"/>
+              </w:rPr>
+              <w:t xml:space="preserve">docs/qa/search-fix-verify-20260616/</w:t>
+            </w:r>
+            <w:r>
+              <w:t xml:space="preserve"> </w:t>
+            </w:r>
+            <w:r>
+              <w:t xml:space="preserve">§1,§6). ReDoS fix in source not yet deployed (RW-06); CAPTCHA password-login still operator-blocked (BOB-008)</w:t>
             </w:r>
           </w:p>
         </w:tc>
@@ -20296,7 +21127,75 @@
               <w:pStyle w:val="Compact"/>
             </w:pPr>
             <w:r>
-              <w:t xml:space="preserve">partial — live-gated</w:t>
+              <w:rPr>
+                <w:b/>
+                <w:bCs/>
+              </w:rPr>
+              <w:t xml:space="preserve">PASS — LIVE 2026-06-16</w:t>
+            </w:r>
+            <w:r>
+              <w:t xml:space="preserve"> </w:t>
+            </w:r>
+            <w:r>
+              <w:t xml:space="preserve">— full-fleet</w:t>
+            </w:r>
+            <w:r>
+              <w:t xml:space="preserve"> </w:t>
+            </w:r>
+            <w:r>
+              <w:rPr>
+                <w:rStyle w:val="VerbatimChar"/>
+              </w:rPr>
+              <w:t xml:space="preserve">the matrix</w:t>
+            </w:r>
+            <w:r>
+              <w:t xml:space="preserve"> </w:t>
+            </w:r>
+            <w:r>
+              <w:t xml:space="preserve">on nezha:</w:t>
+            </w:r>
+            <w:r>
+              <w:t xml:space="preserve"> </w:t>
+            </w:r>
+            <w:r>
+              <w:rPr>
+                <w:b/>
+                <w:bCs/>
+              </w:rPr>
+              <w:t xml:space="preserve">50</w:t>
+            </w:r>
+            <w:r>
+              <w:t xml:space="preserve"> </w:t>
+            </w:r>
+            <w:r>
+              <w:t xml:space="preserve">results,</w:t>
+            </w:r>
+            <w:r>
+              <w:t xml:space="preserve"> </w:t>
+            </w:r>
+            <w:r>
+              <w:rPr>
+                <w:rStyle w:val="VerbatimChar"/>
+              </w:rPr>
+              <w:t xml:space="preserve">success</w:t>
+            </w:r>
+            <w:r>
+              <w:t xml:space="preserve"> </w:t>
+            </w:r>
+            <w:r>
+              <w:t xml:space="preserve">(</w:t>
+            </w:r>
+            <w:r>
+              <w:rPr>
+                <w:rStyle w:val="VerbatimChar"/>
+              </w:rPr>
+              <w:t xml:space="preserve">docs/qa/search-fix-verify-20260616/</w:t>
+            </w:r>
+            <w:r>
+              <w:t xml:space="preserve"> </w:t>
+            </w:r>
+            <w:r>
+              <w:t xml:space="preserve">§6)</w:t>
             </w:r>
           </w:p>
         </w:tc>
@@ -20387,7 +21286,84 @@
               <w:pStyle w:val="Compact"/>
             </w:pPr>
             <w:r>
-              <w:t xml:space="preserve">partial — live-gated</w:t>
+              <w:rPr>
+                <w:b/>
+                <w:bCs/>
+              </w:rPr>
+              <w:t xml:space="preserve">PASS — LIVE 2026-06-16</w:t>
+            </w:r>
+            <w:r>
+              <w:t xml:space="preserve"> </w:t>
+            </w:r>
+            <w:r>
+              <w:t xml:space="preserve">—</w:t>
+            </w:r>
+            <w:r>
+              <w:t xml:space="preserve"> </w:t>
+            </w:r>
+            <w:r>
+              <w:rPr>
+                <w:rStyle w:val="VerbatimChar"/>
+              </w:rPr>
+              <w:t xml:space="preserve">NNMCLUB_COOKIES</w:t>
+            </w:r>
+            <w:r>
+              <w:t xml:space="preserve"> </w:t>
+            </w:r>
+            <w:r>
+              <w:t xml:space="preserve">auth (Cloudflare Turnstile bypass):</w:t>
+            </w:r>
+            <w:r>
+              <w:t xml:space="preserve"> </w:t>
+            </w:r>
+            <w:r>
+              <w:rPr>
+                <w:rStyle w:val="VerbatimChar"/>
+              </w:rPr>
+              <w:t xml:space="preserve">the matrix</w:t>
+            </w:r>
+            <w:r>
+              <w:t xml:space="preserve"> </w:t>
+            </w:r>
+            <w:r>
+              <w:t xml:space="preserve">returns</w:t>
+            </w:r>
+            <w:r>
+              <w:t xml:space="preserve"> </w:t>
+            </w:r>
+            <w:r>
+              <w:rPr>
+                <w:b/>
+                <w:bCs/>
+              </w:rPr>
+              <w:t xml:space="preserve">50</w:t>
+            </w:r>
+            <w:r>
+              <w:t xml:space="preserve"> </w:t>
+            </w:r>
+            <w:r>
+              <w:t xml:space="preserve">results incl. </w:t>
+            </w:r>
+            <w:r>
+              <w:t xml:space="preserve">“Matrix Resurrections (2021)”</w:t>
+            </w:r>
+            <w:r>
+              <w:t xml:space="preserve"> </w:t>
+            </w:r>
+            <w:r>
+              <w:t xml:space="preserve">(</w:t>
+            </w:r>
+            <w:r>
+              <w:rPr>
+                <w:rStyle w:val="VerbatimChar"/>
+              </w:rPr>
+              <w:t xml:space="preserve">docs/qa/search-fix-verify-20260616/</w:t>
+            </w:r>
+            <w:r>
+              <w:t xml:space="preserve"> </w:t>
+            </w:r>
+            <w:r>
+              <w:t xml:space="preserve">§1,§6)</w:t>
             </w:r>
           </w:p>
         </w:tc>

</xml_diff>